<commit_message>
correct word and pdf
</commit_message>
<xml_diff>
--- a/AnaRCorreia-CV.docx
+++ b/AnaRCorreia-CV.docx
@@ -884,7 +884,19 @@
               <w:pStyle w:val="ExperienceDeets"/>
             </w:pPr>
             <w:r>
-              <w:t>Integrated multidisciplinary teams focused on leveraging and structuring data for ML/AI applications.</w:t>
+              <w:t xml:space="preserve">Integrated multidisciplinary teams focused on leveraging and structuring data for </w:t>
+            </w:r>
+            <w:r>
+              <w:t>AI</w:t>
+            </w:r>
+            <w:r>
+              <w:t>/</w:t>
+            </w:r>
+            <w:r>
+              <w:t>ML</w:t>
+            </w:r>
+            <w:r>
+              <w:t xml:space="preserve"> applications.</w:t>
             </w:r>
           </w:p>
           <w:p>
@@ -1310,7 +1322,7 @@
               <w:pStyle w:val="ExperienceDeets"/>
             </w:pPr>
             <w:r>
-              <w:t>In vivo (yeast cells) and ex vivo (isolated mitochondria) characterization of a mitochondrial protein biogenesis.</w:t>
+              <w:t>Conformational and functional characterization of a mitochondrial protein using different biophysical techniques namely: fluorescence spectroscopy, differential scanning calorimetry, calorimetry, circular dichroism and NMR.</w:t>
             </w:r>
           </w:p>
           <w:p>
@@ -1380,7 +1392,7 @@
               <w:pStyle w:val="ExperienceDeets"/>
             </w:pPr>
             <w:r>
-              <w:t>In vivo (yeast cells) and ex vivo (isolated mitochondria) characterization of a mitochondrial protein biogenesis.</w:t>
+              <w:t>Research training on molecular biology and NMR.</w:t>
             </w:r>
           </w:p>
           <w:p>
@@ -1535,7 +1547,14 @@
               <w:t>Apache Spark for Data Engineering and Machine Learning by IBM on edX (2023)</w:t>
             </w:r>
           </w:p>
-          <w:p/>
+          <w:p>
+            <w:pPr>
+              <w:pStyle w:val="MainSectionExtra"/>
+            </w:pPr>
+            <w:r>
+              <w:t>Proactively advancing my expertise in computational biology and data science to stay at the forefront of emerging industry methodologies and technologies.</w:t>
+            </w:r>
+          </w:p>
           <w:p>
             <w:pPr>
               <w:pStyle w:val="MainSectionTitle"/>
@@ -2038,14 +2057,6 @@
                 <w:t>, 398, 605-611. *</w:t>
               </w:r>
             </w:hyperlink>
-          </w:p>
-          <w:p>
-            <w:pPr>
-              <w:spacing w:before="40" w:after="40"/>
-              <w:rPr>
-                <w:noProof/>
-              </w:rPr>
-            </w:pPr>
           </w:p>
         </w:tc>
       </w:tr>
@@ -3420,7 +3431,6 @@
   <w:style w:type="character" w:default="1" w:styleId="DefaultParagraphFont">
     <w:name w:val="Default Paragraph Font"/>
     <w:uiPriority w:val="1"/>
-    <w:semiHidden/>
     <w:unhideWhenUsed/>
   </w:style>
   <w:style w:type="table" w:default="1" w:styleId="TableNormal">
@@ -3886,6 +3896,31 @@
       <w:noProof/>
       <w:sz w:val="64"/>
       <w:szCs w:val="56"/>
+    </w:rPr>
+  </w:style>
+  <w:style w:type="paragraph" w:customStyle="1" w:styleId="MainSectionExtra">
+    <w:name w:val="Main Section Extra"/>
+    <w:basedOn w:val="Normal"/>
+    <w:link w:val="MainSectionExtraChar"/>
+    <w:qFormat/>
+    <w:rsid w:val="0049232B"/>
+    <w:pPr>
+      <w:spacing w:before="160" w:after="120"/>
+    </w:pPr>
+    <w:rPr>
+      <w:sz w:val="22"/>
+      <w:szCs w:val="22"/>
+    </w:rPr>
+  </w:style>
+  <w:style w:type="character" w:customStyle="1" w:styleId="MainSectionExtraChar">
+    <w:name w:val="Main Section Extra Char"/>
+    <w:basedOn w:val="DefaultParagraphFont"/>
+    <w:link w:val="MainSectionExtra"/>
+    <w:rsid w:val="0049232B"/>
+    <w:rPr>
+      <w:rFonts w:asciiTheme="minorHAnsi" w:hAnsiTheme="minorHAnsi"/>
+      <w:sz w:val="22"/>
+      <w:szCs w:val="22"/>
     </w:rPr>
   </w:style>
 </w:styles>

</xml_diff>